<commit_message>
Align Jeff Watson OA DOCX with PDF text
</commit_message>
<xml_diff>
--- a/Project Rooms/Operating Agreements/sources/Corp-Sell Your Home 83-4027719/Jeff Watson/Sell Your Home LLC (Browning & Hollinger) AMENDED AND RESTATED IRA-OWNED LLC OPERATING AGREEMENT.docx
+++ b/Project Rooms/Operating Agreements/sources/Corp-Sell Your Home 83-4027719/Jeff Watson/Sell Your Home LLC (Browning & Hollinger) AMENDED AND RESTATED IRA-OWNED LLC OPERATING AGREEMENT.docx
@@ -358,7 +358,7 @@
         <w:rPr>
           <w:b/>
         </w:rPr>
-        <w:t>longterm</w:t>
+        <w:t>long term</w:t>
       </w:r>
       <w:proofErr w:type="spellEnd"/>
       <w:r>
@@ -3337,7 +3337,7 @@
           <w:b/>
           <w:u w:val="single" w:color="000000"/>
         </w:rPr>
-        <w:t>CAPITAL CONTRIBUTIONS; ALLOCATIONS AND DISTRIBUTIONS</w:t>
+        <w:t>Fiscal Matters</w:t>
       </w:r>
     </w:p>
     <w:p>
@@ -3728,7 +3728,7 @@
         <w:t>Company as Pass-Through Entity</w:t>
       </w:r>
       <w:r>
-        <w:t xml:space="preserve">.  The Company shall be classified, for federal income tax purposes, as a pass-through entity, either as a disregarded entity if there is only a single Member or as a partnership if there are multiple Members.  The Manager(s) shall not take any actions or make any tax filings or declarations that would change the Company’s classification to anything other than a passthrough entity. </w:t>
+        <w:t xml:space="preserve">.  The Company shall be classified, for federal income tax purposes, as a pass-through entity, either as a disregarded entity if there is only a single Member or as a partnership if there are multiple Members.  The Manager(s) shall not take any actions or make any tax filings or declarations that would change the Company’s classification to anything other than a pass-through entity. </w:t>
       </w:r>
     </w:p>
     <w:p>
@@ -5403,7 +5403,7 @@
               <w:t>Browning Roth IRA #</w:t>
             </w:r>
             <w:r>
-              <w:t xml:space="preserve"> </w:t>
+              <w:t xml:space="preserve"/>
             </w:r>
             <w:r>
               <w:rPr>
@@ -5411,7 +5411,7 @@
                 <w:bCs/>
                 <w:u w:val="single"/>
               </w:rPr>
-              <w:t>8870274</w:t>
+              <w:t>______________</w:t>
             </w:r>
             <w:r>
               <w:rPr>
@@ -5524,7 +5524,7 @@
               <w:t>Hollinger Roth IRA #</w:t>
             </w:r>
             <w:r>
-              <w:t xml:space="preserve"> </w:t>
+              <w:t xml:space="preserve"/>
             </w:r>
             <w:r>
               <w:rPr>
@@ -5532,7 +5532,7 @@
                 <w:bCs/>
                 <w:u w:val="single"/>
               </w:rPr>
-              <w:t>61077178</w:t>
+              <w:t>______________</w:t>
             </w:r>
           </w:p>
           <w:p>

</xml_diff>

<commit_message>
Restore Roth IRA numbers in Jeff Watson OA DOCX
</commit_message>
<xml_diff>
--- a/Project Rooms/Operating Agreements/sources/Corp-Sell Your Home 83-4027719/Jeff Watson/Sell Your Home LLC (Browning & Hollinger) AMENDED AND RESTATED IRA-OWNED LLC OPERATING AGREEMENT.docx
+++ b/Project Rooms/Operating Agreements/sources/Corp-Sell Your Home 83-4027719/Jeff Watson/Sell Your Home LLC (Browning & Hollinger) AMENDED AND RESTATED IRA-OWNED LLC OPERATING AGREEMENT.docx
@@ -5403,7 +5403,7 @@
               <w:t>Browning Roth IRA #</w:t>
             </w:r>
             <w:r>
-              <w:t xml:space="preserve"/>
+              <w:t xml:space="preserve"> </w:t>
             </w:r>
             <w:r>
               <w:rPr>
@@ -5411,7 +5411,7 @@
                 <w:bCs/>
                 <w:u w:val="single"/>
               </w:rPr>
-              <w:t>______________</w:t>
+              <w:t>8870274</w:t>
             </w:r>
             <w:r>
               <w:rPr>
@@ -5524,7 +5524,7 @@
               <w:t>Hollinger Roth IRA #</w:t>
             </w:r>
             <w:r>
-              <w:t xml:space="preserve"/>
+              <w:t xml:space="preserve"> </w:t>
             </w:r>
             <w:r>
               <w:rPr>
@@ -5532,7 +5532,7 @@
                 <w:bCs/>
                 <w:u w:val="single"/>
               </w:rPr>
-              <w:t>______________</w:t>
+              <w:t>61077178</w:t>
             </w:r>
           </w:p>
           <w:p>

</xml_diff>